<commit_message>
docs(guide): 3.5 대시보드 띄우기 — python start.py --dashboard · streamlit 한 줄 · 화면 ①②③ 누르는 순서 (뒤 번호 3.6~3.9 로)
Co-Authored-By: Claude Fable 5.1 <noreply@anthropic.com>
Claude-Session: https://claude.ai/code/session_01PXwSD6j8ZQUw9LhbxszCjd
</commit_message>
<xml_diff>
--- a/docs/inframon_워크플로우_안내서.docx
+++ b/docs/inframon_워크플로우_안내서.docx
@@ -1419,6 +1419,80 @@
             <w:r>
               <w:rPr>
                 <w:rFonts w:ascii="맑은 고딕" w:hAnsi="맑은 고딕" w:eastAsia="맑은 고딕"/>
+                <w:b/>
+                <w:sz w:val="19"/>
+              </w:rPr>
+              <w:t>대시보드 띄우기</w:t>
+            </w:r>
+            <w:r>
+              <w:rPr>
+                <w:rFonts w:ascii="맑은 고딕" w:hAnsi="맑은 고딕" w:eastAsia="맑은 고딕"/>
+                <w:b w:val="0"/>
+                <w:sz w:val="19"/>
+              </w:rPr>
+              <w:t xml:space="preserve"> — 화면으로 보고 누르기</w:t>
+            </w:r>
+          </w:p>
+        </w:tc>
+        <w:tc>
+          <w:tcPr>
+            <w:tcW w:type="dxa" w:w="1020"/>
+          </w:tcPr>
+          <w:p>
+            <w:r/>
+            <w:r>
+              <w:rPr>
+                <w:rFonts w:ascii="맑은 고딕" w:hAnsi="맑은 고딕" w:eastAsia="맑은 고딕"/>
+                <w:b w:val="0"/>
+                <w:sz w:val="19"/>
+              </w:rPr>
+              <w:t>20초</w:t>
+            </w:r>
+          </w:p>
+        </w:tc>
+        <w:tc>
+          <w:tcPr>
+            <w:tcW w:type="dxa" w:w="2494"/>
+          </w:tcPr>
+          <w:p>
+            <w:r/>
+            <w:r>
+              <w:rPr>
+                <w:rFonts w:ascii="맑은 고딕" w:hAnsi="맑은 고딕" w:eastAsia="맑은 고딕"/>
+                <w:b w:val="0"/>
+                <w:sz w:val="19"/>
+              </w:rPr>
+              <w:t>브라우저에 http://localhost:8501</w:t>
+            </w:r>
+          </w:p>
+        </w:tc>
+      </w:tr>
+      <w:tr>
+        <w:tc>
+          <w:tcPr>
+            <w:tcW w:type="dxa" w:w="680"/>
+          </w:tcPr>
+          <w:p>
+            <w:r/>
+            <w:r>
+              <w:rPr>
+                <w:rFonts w:ascii="맑은 고딕" w:hAnsi="맑은 고딕" w:eastAsia="맑은 고딕"/>
+                <w:b w:val="0"/>
+                <w:sz w:val="19"/>
+              </w:rPr>
+              <w:t>3.6</w:t>
+            </w:r>
+          </w:p>
+        </w:tc>
+        <w:tc>
+          <w:tcPr>
+            <w:tcW w:type="dxa" w:w="4876"/>
+          </w:tcPr>
+          <w:p>
+            <w:r/>
+            <w:r>
+              <w:rPr>
+                <w:rFonts w:ascii="맑은 고딕" w:hAnsi="맑은 고딕" w:eastAsia="맑은 고딕"/>
                 <w:b w:val="0"/>
                 <w:sz w:val="19"/>
               </w:rPr>
@@ -1472,7 +1546,7 @@
                 <w:b w:val="0"/>
                 <w:sz w:val="19"/>
               </w:rPr>
-              <w:t>3.6</w:t>
+              <w:t>3.7</w:t>
             </w:r>
           </w:p>
         </w:tc>
@@ -1538,7 +1612,7 @@
                 <w:b w:val="0"/>
                 <w:sz w:val="19"/>
               </w:rPr>
-              <w:t>3.7</w:t>
+              <w:t>3.8</w:t>
             </w:r>
           </w:p>
         </w:tc>
@@ -1604,7 +1678,7 @@
                 <w:b w:val="0"/>
                 <w:sz w:val="19"/>
               </w:rPr>
-              <w:t>3.8</w:t>
+              <w:t>3.9</w:t>
             </w:r>
           </w:p>
         </w:tc>
@@ -2810,7 +2884,552 @@
           <w:color w:val="1F3A5F"/>
           <w:sz w:val="26"/>
         </w:rPr>
-        <w:t>3.5 먼저 되는 것으로 한 번 — 정자교 시연 (44초)</w:t>
+        <w:t>3.5 대시보드 띄우기 (20초)</w:t>
+      </w:r>
+    </w:p>
+    <w:p>
+      <w:pPr>
+        <w:spacing w:after="120"/>
+      </w:pPr>
+      <w:r>
+        <w:rPr>
+          <w:rFonts w:ascii="맑은 고딕" w:hAnsi="맑은 고딕" w:eastAsia="맑은 고딕"/>
+          <w:b w:val="0"/>
+          <w:sz w:val="21"/>
+        </w:rPr>
+        <w:t>명령 대신 화면으로 하려면 대시보드를 띄웁니다. 3.1 의 한 줄 설치기는 끝에 자동으로 띄우지만, `--tools` 나 `--full` 만 돌렸으면 뜨지 않으니 따로 띄웁니다:</w:t>
+      </w:r>
+    </w:p>
+    <w:p>
+      <w:pPr>
+        <w:spacing w:after="160"/>
+        <w:ind w:left="340"/>
+        <w:shd w:val="clear" w:color="auto" w:fill="F2F4F7"/>
+      </w:pPr>
+      <w:r>
+        <w:rPr>
+          <w:rFonts w:ascii="Consolas" w:hAnsi="Consolas" w:eastAsia="Consolas"/>
+          <w:b w:val="0"/>
+          <w:color w:val="1B2631"/>
+          <w:sz w:val="19"/>
+        </w:rPr>
+        <w:t>python start.py --dashboard                                  # 브라우저 자동 열림 (설치 상태도 같이 확인)</w:t>
+        <w:br/>
+      </w:r>
+      <w:r>
+        <w:rPr>
+          <w:rFonts w:ascii="Consolas" w:hAnsi="Consolas" w:eastAsia="Consolas"/>
+          <w:b w:val="0"/>
+          <w:color w:val="1B2631"/>
+          <w:sz w:val="19"/>
+        </w:rPr>
+        <w:t>.venv\Scripts\streamlit run src\inframon\dashboard\app.py     # 다음부터 대시보드만 바로</w:t>
+      </w:r>
+    </w:p>
+    <w:p>
+      <w:pPr>
+        <w:spacing w:after="120"/>
+      </w:pPr>
+      <w:r>
+        <w:rPr>
+          <w:rFonts w:ascii="맑은 고딕" w:hAnsi="맑은 고딕" w:eastAsia="맑은 고딕"/>
+          <w:b w:val="0"/>
+          <w:sz w:val="21"/>
+        </w:rPr>
+        <w:t xml:space="preserve">브라우저가 자동으로 열립니다. 안 열리면 주소창에 </w:t>
+      </w:r>
+      <w:r>
+        <w:rPr>
+          <w:rFonts w:ascii="맑은 고딕" w:hAnsi="맑은 고딕" w:eastAsia="맑은 고딕"/>
+          <w:b/>
+          <w:sz w:val="21"/>
+        </w:rPr>
+        <w:t>http://localhost:8501</w:t>
+      </w:r>
+      <w:r>
+        <w:rPr>
+          <w:rFonts w:ascii="맑은 고딕" w:hAnsi="맑은 고딕" w:eastAsia="맑은 고딕"/>
+          <w:b w:val="0"/>
+          <w:sz w:val="21"/>
+        </w:rPr>
+        <w:t xml:space="preserve"> 을 직접 칩니다. 끄려면 그 터미널에서 </w:t>
+      </w:r>
+      <w:r>
+        <w:rPr>
+          <w:rFonts w:ascii="맑은 고딕" w:hAnsi="맑은 고딕" w:eastAsia="맑은 고딕"/>
+          <w:b/>
+          <w:sz w:val="21"/>
+        </w:rPr>
+        <w:t>Ctrl + C</w:t>
+      </w:r>
+      <w:r>
+        <w:rPr>
+          <w:rFonts w:ascii="맑은 고딕" w:hAnsi="맑은 고딕" w:eastAsia="맑은 고딕"/>
+          <w:b w:val="0"/>
+          <w:sz w:val="21"/>
+        </w:rPr>
+        <w:t>.</w:t>
+      </w:r>
+    </w:p>
+    <w:p>
+      <w:pPr>
+        <w:jc w:val="center"/>
+      </w:pPr>
+      <w:r>
+        <w:drawing>
+          <wp:inline xmlns:a="http://schemas.openxmlformats.org/drawingml/2006/main" xmlns:pic="http://schemas.openxmlformats.org/drawingml/2006/picture">
+            <wp:extent cx="5760000" cy="2733061"/>
+            <wp:docPr id="1" name="Picture 1"/>
+            <wp:cNvGraphicFramePr>
+              <a:graphicFrameLocks noChangeAspect="1"/>
+            </wp:cNvGraphicFramePr>
+            <a:graphic>
+              <a:graphicData uri="http://schemas.openxmlformats.org/drawingml/2006/picture">
+                <pic:pic>
+                  <pic:nvPicPr>
+                    <pic:cNvPr id="0" name="dashboard_start.jpg"/>
+                    <pic:cNvPicPr/>
+                  </pic:nvPicPr>
+                  <pic:blipFill>
+                    <a:blip r:embed="rId9"/>
+                    <a:stretch>
+                      <a:fillRect/>
+                    </a:stretch>
+                  </pic:blipFill>
+                  <pic:spPr>
+                    <a:xfrm>
+                      <a:off x="0" y="0"/>
+                      <a:ext cx="5760000" cy="2733061"/>
+                    </a:xfrm>
+                    <a:prstGeom prst="rect"/>
+                  </pic:spPr>
+                </pic:pic>
+              </a:graphicData>
+            </a:graphic>
+          </wp:inline>
+        </w:drawing>
+      </w:r>
+    </w:p>
+    <w:p>
+      <w:pPr>
+        <w:spacing w:after="200"/>
+        <w:jc w:val="center"/>
+      </w:pPr>
+      <w:r>
+        <w:rPr>
+          <w:rFonts w:ascii="맑은 고딕" w:hAnsi="맑은 고딕" w:eastAsia="맑은 고딕"/>
+          <w:b w:val="0"/>
+          <w:color w:val="555F6B"/>
+          <w:sz w:val="18"/>
+        </w:rPr>
+        <w:t>그림 1. 대시보드 — 왼쪽에서 교량을 고르고, 본문 ①→②→③ 순으로 누른다.</w:t>
+      </w:r>
+    </w:p>
+    <w:tbl>
+      <w:tblPr>
+        <w:tblStyle w:val="TableGrid"/>
+        <w:tblW w:type="auto" w:w="0"/>
+        <w:jc w:val="center"/>
+        <w:tblLook w:firstColumn="1" w:firstRow="1" w:lastColumn="0" w:lastRow="0" w:noHBand="0" w:noVBand="1" w:val="04A0"/>
+      </w:tblPr>
+      <w:tblGrid>
+        <w:gridCol w:w="3249"/>
+        <w:gridCol w:w="3249"/>
+        <w:gridCol w:w="3249"/>
+      </w:tblGrid>
+      <w:tr>
+        <w:tc>
+          <w:tcPr>
+            <w:tcW w:type="dxa" w:w="680"/>
+            <w:shd w:val="clear" w:color="auto" w:fill="DCE6F1"/>
+          </w:tcPr>
+          <w:p>
+            <w:r/>
+            <w:r>
+              <w:rPr>
+                <w:rFonts w:ascii="맑은 고딕" w:hAnsi="맑은 고딕" w:eastAsia="맑은 고딕"/>
+                <w:b/>
+                <w:sz w:val="19"/>
+              </w:rPr>
+              <w:t>순서</w:t>
+            </w:r>
+          </w:p>
+        </w:tc>
+        <w:tc>
+          <w:tcPr>
+            <w:tcW w:type="dxa" w:w="2154"/>
+            <w:shd w:val="clear" w:color="auto" w:fill="DCE6F1"/>
+          </w:tcPr>
+          <w:p>
+            <w:r/>
+            <w:r>
+              <w:rPr>
+                <w:rFonts w:ascii="맑은 고딕" w:hAnsi="맑은 고딕" w:eastAsia="맑은 고딕"/>
+                <w:b/>
+                <w:sz w:val="19"/>
+              </w:rPr>
+              <w:t>화면</w:t>
+            </w:r>
+          </w:p>
+        </w:tc>
+        <w:tc>
+          <w:tcPr>
+            <w:tcW w:type="dxa" w:w="6236"/>
+            <w:shd w:val="clear" w:color="auto" w:fill="DCE6F1"/>
+          </w:tcPr>
+          <w:p>
+            <w:r/>
+            <w:r>
+              <w:rPr>
+                <w:rFonts w:ascii="맑은 고딕" w:hAnsi="맑은 고딕" w:eastAsia="맑은 고딕"/>
+                <w:b/>
+                <w:sz w:val="19"/>
+              </w:rPr>
+              <w:t>누를 것</w:t>
+            </w:r>
+          </w:p>
+        </w:tc>
+      </w:tr>
+      <w:tr>
+        <w:tc>
+          <w:tcPr>
+            <w:tcW w:type="dxa" w:w="680"/>
+          </w:tcPr>
+          <w:p>
+            <w:r/>
+            <w:r>
+              <w:rPr>
+                <w:rFonts w:ascii="맑은 고딕" w:hAnsi="맑은 고딕" w:eastAsia="맑은 고딕"/>
+                <w:b w:val="0"/>
+                <w:sz w:val="19"/>
+              </w:rPr>
+              <w:t>①</w:t>
+            </w:r>
+          </w:p>
+        </w:tc>
+        <w:tc>
+          <w:tcPr>
+            <w:tcW w:type="dxa" w:w="2154"/>
+          </w:tcPr>
+          <w:p>
+            <w:r/>
+            <w:r>
+              <w:rPr>
+                <w:rFonts w:ascii="맑은 고딕" w:hAnsi="맑은 고딕" w:eastAsia="맑은 고딕"/>
+                <w:b w:val="0"/>
+                <w:sz w:val="19"/>
+              </w:rPr>
+              <w:t>이 컴퓨터 준비 상태</w:t>
+            </w:r>
+          </w:p>
+        </w:tc>
+        <w:tc>
+          <w:tcPr>
+            <w:tcW w:type="dxa" w:w="6236"/>
+          </w:tcPr>
+          <w:p>
+            <w:r/>
+            <w:r>
+              <w:rPr>
+                <w:rFonts w:ascii="맑은 고딕" w:hAnsi="맑은 고딕" w:eastAsia="맑은 고딕"/>
+                <w:b w:val="0"/>
+                <w:sz w:val="19"/>
+              </w:rPr>
+              <w:t>보기만. '모든 항목 준비 완료' 면 아래로. 막힌 항목이 있으면 🔧 외부 도구 준비 펼침에서 버튼/붙여넣기</w:t>
+            </w:r>
+          </w:p>
+        </w:tc>
+      </w:tr>
+      <w:tr>
+        <w:tc>
+          <w:tcPr>
+            <w:tcW w:type="dxa" w:w="680"/>
+          </w:tcPr>
+          <w:p>
+            <w:r/>
+            <w:r>
+              <w:rPr>
+                <w:rFonts w:ascii="맑은 고딕" w:hAnsi="맑은 고딕" w:eastAsia="맑은 고딕"/>
+                <w:b w:val="0"/>
+                <w:sz w:val="19"/>
+              </w:rPr>
+              <w:t>②</w:t>
+            </w:r>
+          </w:p>
+        </w:tc>
+        <w:tc>
+          <w:tcPr>
+            <w:tcW w:type="dxa" w:w="2154"/>
+          </w:tcPr>
+          <w:p>
+            <w:r/>
+            <w:r>
+              <w:rPr>
+                <w:rFonts w:ascii="맑은 고딕" w:hAnsi="맑은 고딕" w:eastAsia="맑은 고딕"/>
+                <w:b w:val="0"/>
+                <w:sz w:val="19"/>
+              </w:rPr>
+              <w:t>교량 선택</w:t>
+            </w:r>
+          </w:p>
+        </w:tc>
+        <w:tc>
+          <w:tcPr>
+            <w:tcW w:type="dxa" w:w="6236"/>
+          </w:tcPr>
+          <w:p>
+            <w:r/>
+            <w:r>
+              <w:rPr>
+                <w:rFonts w:ascii="맑은 고딕" w:hAnsi="맑은 고딕" w:eastAsia="맑은 고딕"/>
+                <w:b/>
+                <w:sz w:val="19"/>
+              </w:rPr>
+              <w:t>교량명</w:t>
+            </w:r>
+            <w:r>
+              <w:rPr>
+                <w:rFonts w:ascii="맑은 고딕" w:hAnsi="맑은 고딕" w:eastAsia="맑은 고딕"/>
+                <w:b w:val="0"/>
+                <w:sz w:val="19"/>
+              </w:rPr>
+              <w:t xml:space="preserve"> 입력 → </w:t>
+            </w:r>
+            <w:r>
+              <w:rPr>
+                <w:rFonts w:ascii="맑은 고딕" w:hAnsi="맑은 고딕" w:eastAsia="맑은 고딕"/>
+                <w:b/>
+                <w:sz w:val="19"/>
+              </w:rPr>
+              <w:t>🔎 찾기</w:t>
+            </w:r>
+            <w:r>
+              <w:rPr>
+                <w:rFonts w:ascii="맑은 고딕" w:hAnsi="맑은 고딕" w:eastAsia="맑은 고딕"/>
+                <w:b w:val="0"/>
+                <w:sz w:val="19"/>
+              </w:rPr>
+              <w:t xml:space="preserve"> (또는 </w:t>
+            </w:r>
+            <w:r>
+              <w:rPr>
+                <w:rFonts w:ascii="맑은 고딕" w:hAnsi="맑은 고딕" w:eastAsia="맑은 고딕"/>
+                <w:b/>
+                <w:sz w:val="19"/>
+              </w:rPr>
+              <w:t>위도·경도</w:t>
+            </w:r>
+            <w:r>
+              <w:rPr>
+                <w:rFonts w:ascii="맑은 고딕" w:hAnsi="맑은 고딕" w:eastAsia="맑은 고딕"/>
+                <w:b w:val="0"/>
+                <w:sz w:val="19"/>
+              </w:rPr>
+              <w:t xml:space="preserve"> 칸에 직접 입력)</w:t>
+            </w:r>
+          </w:p>
+        </w:tc>
+      </w:tr>
+      <w:tr>
+        <w:tc>
+          <w:tcPr>
+            <w:tcW w:type="dxa" w:w="680"/>
+          </w:tcPr>
+          <w:p>
+            <w:r/>
+            <w:r>
+              <w:rPr>
+                <w:rFonts w:ascii="맑은 고딕" w:hAnsi="맑은 고딕" w:eastAsia="맑은 고딕"/>
+                <w:b w:val="0"/>
+                <w:sz w:val="19"/>
+              </w:rPr>
+              <w:t>③</w:t>
+            </w:r>
+          </w:p>
+        </w:tc>
+        <w:tc>
+          <w:tcPr>
+            <w:tcW w:type="dxa" w:w="2154"/>
+          </w:tcPr>
+          <w:p>
+            <w:r/>
+            <w:r>
+              <w:rPr>
+                <w:rFonts w:ascii="맑은 고딕" w:hAnsi="맑은 고딕" w:eastAsia="맑은 고딕"/>
+                <w:b w:val="0"/>
+                <w:sz w:val="19"/>
+              </w:rPr>
+              <w:t>전 과정 실행</w:t>
+            </w:r>
+          </w:p>
+        </w:tc>
+        <w:tc>
+          <w:tcPr>
+            <w:tcW w:type="dxa" w:w="6236"/>
+          </w:tcPr>
+          <w:p>
+            <w:r/>
+            <w:r>
+              <w:rPr>
+                <w:rFonts w:ascii="맑은 고딕" w:hAnsi="맑은 고딕" w:eastAsia="맑은 고딕"/>
+                <w:b w:val="0"/>
+                <w:sz w:val="19"/>
+              </w:rPr>
+              <w:t xml:space="preserve">먼저 </w:t>
+            </w:r>
+            <w:r>
+              <w:rPr>
+                <w:rFonts w:ascii="맑은 고딕" w:hAnsi="맑은 고딕" w:eastAsia="맑은 고딕"/>
+                <w:b/>
+                <w:sz w:val="19"/>
+              </w:rPr>
+              <w:t>📋 계획 보기</w:t>
+            </w:r>
+            <w:r>
+              <w:rPr>
+                <w:rFonts w:ascii="맑은 고딕" w:hAnsi="맑은 고딕" w:eastAsia="맑은 고딕"/>
+                <w:b w:val="0"/>
+                <w:sz w:val="19"/>
+              </w:rPr>
+              <w:t xml:space="preserve"> (10~30초, SLC 몇 장인지 확인) → 그다음 </w:t>
+            </w:r>
+            <w:r>
+              <w:rPr>
+                <w:rFonts w:ascii="맑은 고딕" w:hAnsi="맑은 고딕" w:eastAsia="맑은 고딕"/>
+                <w:b/>
+                <w:sz w:val="19"/>
+              </w:rPr>
+              <w:t>▶ 전체 실행</w:t>
+            </w:r>
+            <w:r>
+              <w:rPr>
+                <w:rFonts w:ascii="맑은 고딕" w:hAnsi="맑은 고딕" w:eastAsia="맑은 고딕"/>
+                <w:b w:val="0"/>
+                <w:sz w:val="19"/>
+              </w:rPr>
+              <w:t xml:space="preserve"> (1~3시간)</w:t>
+            </w:r>
+          </w:p>
+        </w:tc>
+      </w:tr>
+    </w:tbl>
+    <w:p>
+      <w:pPr>
+        <w:spacing w:after="80"/>
+      </w:pPr>
+    </w:p>
+    <w:p>
+      <w:pPr>
+        <w:spacing w:after="120"/>
+      </w:pPr>
+      <w:r>
+        <w:rPr>
+          <w:rFonts w:ascii="맑은 고딕" w:hAnsi="맑은 고딕" w:eastAsia="맑은 고딕"/>
+          <w:b w:val="0"/>
+          <w:sz w:val="21"/>
+        </w:rPr>
+        <w:t xml:space="preserve">3.6~3.8 의 명령줄과 같은 일을 이 세 단계가 합니다. 진행 상황에 `②④ SLC·트랙·프레임 — ASC path127 · 41장` 처럼 ✅ 가 찍히면 그 교량은 돌릴 수 있는 것입니다. 왼쪽 사이드바 </w:t>
+      </w:r>
+      <w:r>
+        <w:rPr>
+          <w:rFonts w:ascii="맑은 고딕" w:hAnsi="맑은 고딕" w:eastAsia="맑은 고딕"/>
+          <w:b/>
+          <w:sz w:val="21"/>
+        </w:rPr>
+        <w:t>🔎 교량명 검색</w:t>
+      </w:r>
+      <w:r>
+        <w:rPr>
+          <w:rFonts w:ascii="맑은 고딕" w:hAnsi="맑은 고딕" w:eastAsia="맑은 고딕"/>
+          <w:b w:val="0"/>
+          <w:sz w:val="21"/>
+        </w:rPr>
+        <w:t xml:space="preserve"> → 지도 마커 클릭 → </w:t>
+      </w:r>
+      <w:r>
+        <w:rPr>
+          <w:rFonts w:ascii="맑은 고딕" w:hAnsi="맑은 고딕" w:eastAsia="맑은 고딕"/>
+          <w:b/>
+          <w:sz w:val="21"/>
+        </w:rPr>
+        <w:t>💾 타깃 저장</w:t>
+      </w:r>
+      <w:r>
+        <w:rPr>
+          <w:rFonts w:ascii="맑은 고딕" w:hAnsi="맑은 고딕" w:eastAsia="맑은 고딕"/>
+          <w:b w:val="0"/>
+          <w:sz w:val="21"/>
+        </w:rPr>
+        <w:t xml:space="preserve"> → </w:t>
+      </w:r>
+      <w:r>
+        <w:rPr>
+          <w:rFonts w:ascii="맑은 고딕" w:hAnsi="맑은 고딕" w:eastAsia="맑은 고딕"/>
+          <w:b/>
+          <w:sz w:val="21"/>
+        </w:rPr>
+        <w:t>🚀 끝까지 돌리기</w:t>
+      </w:r>
+      <w:r>
+        <w:rPr>
+          <w:rFonts w:ascii="맑은 고딕" w:hAnsi="맑은 고딕" w:eastAsia="맑은 고딕"/>
+          <w:b w:val="0"/>
+          <w:sz w:val="21"/>
+        </w:rPr>
+        <w:t xml:space="preserve"> 로 해도 같습니다.</w:t>
+      </w:r>
+    </w:p>
+    <w:p>
+      <w:pPr>
+        <w:spacing w:after="200"/>
+        <w:ind w:left="340"/>
+      </w:pPr>
+      <w:r>
+        <w:rPr>
+          <w:rFonts w:ascii="맑은 고딕" w:hAnsi="맑은 고딕" w:eastAsia="맑은 고딕"/>
+          <w:b/>
+          <w:color w:val="1E7E34"/>
+          <w:sz w:val="21"/>
+        </w:rPr>
+        <w:t xml:space="preserve">확인 ☐  </w:t>
+      </w:r>
+      <w:r>
+        <w:rPr>
+          <w:rFonts w:ascii="맑은 고딕" w:hAnsi="맑은 고딕" w:eastAsia="맑은 고딕"/>
+          <w:b w:val="0"/>
+          <w:sz w:val="21"/>
+        </w:rPr>
+        <w:t xml:space="preserve">브라우저에 그림 1 화면. </w:t>
+      </w:r>
+      <w:r>
+        <w:rPr>
+          <w:rFonts w:ascii="맑은 고딕" w:hAnsi="맑은 고딕" w:eastAsia="맑은 고딕"/>
+          <w:b/>
+          <w:sz w:val="21"/>
+        </w:rPr>
+        <w:t>① 이 컴퓨터 준비 상태</w:t>
+      </w:r>
+      <w:r>
+        <w:rPr>
+          <w:rFonts w:ascii="맑은 고딕" w:hAnsi="맑은 고딕" w:eastAsia="맑은 고딕"/>
+          <w:b w:val="0"/>
+          <w:sz w:val="21"/>
+        </w:rPr>
+        <w:t xml:space="preserve"> 가 '모든 항목 준비 완료'.</w:t>
+      </w:r>
+    </w:p>
+    <w:p>
+      <w:pPr>
+        <w:pStyle w:val="Heading2"/>
+      </w:pPr>
+      <w:r>
+        <w:rPr>
+          <w:rFonts w:ascii="맑은 고딕" w:hAnsi="맑은 고딕" w:eastAsia="맑은 고딕"/>
+          <w:b/>
+          <w:color w:val="1F3A5F"/>
+          <w:sz w:val="26"/>
+        </w:rPr>
+        <w:t>3.6 먼저 되는 것으로 한 번 — 정자교 시연 (44초)</w:t>
       </w:r>
     </w:p>
     <w:p>
@@ -2889,7 +3508,7 @@
         <w:drawing>
           <wp:inline xmlns:a="http://schemas.openxmlformats.org/drawingml/2006/main" xmlns:pic="http://schemas.openxmlformats.org/drawingml/2006/picture">
             <wp:extent cx="5760000" cy="3291429"/>
-            <wp:docPr id="1" name="Picture 1"/>
+            <wp:docPr id="2" name="Picture 2"/>
             <wp:cNvGraphicFramePr>
               <a:graphicFrameLocks noChangeAspect="1"/>
             </wp:cNvGraphicFramePr>
@@ -2901,7 +3520,7 @@
                     <pic:cNvPicPr/>
                   </pic:nvPicPr>
                   <pic:blipFill>
-                    <a:blip r:embed="rId9"/>
+                    <a:blip r:embed="rId10"/>
                     <a:stretch>
                       <a:fillRect/>
                     </a:stretch>
@@ -2932,7 +3551,7 @@
           <w:color w:val="555F6B"/>
           <w:sz w:val="18"/>
         </w:rPr>
-        <w:t>그림 1. 3D 디지털 트윈 — IFC 부재(A1·P1~P4·S1) 위에 InSAR 점. 점을 클릭하면 값·부재·GlobalId.</w:t>
+        <w:t>그림 2. 3D 디지털 트윈 — IFC 부재(A1·P1~P4·S1) 위에 InSAR 점. 점을 클릭하면 값·부재·GlobalId.</w:t>
       </w:r>
     </w:p>
     <w:p>
@@ -2946,7 +3565,7 @@
           <w:color w:val="1F3A5F"/>
           <w:sz w:val="26"/>
         </w:rPr>
-        <w:t>3.6 새 교량 — 계획만 먼저 (1분)</w:t>
+        <w:t>3.7 새 교량 — 계획만 먼저 (1분)</w:t>
       </w:r>
     </w:p>
     <w:p>
@@ -3020,7 +3639,7 @@
           <w:color w:val="1F3A5F"/>
           <w:sz w:val="26"/>
         </w:rPr>
-        <w:t>3.7 새 교량 — 끝까지 (1~3시간)</w:t>
+        <w:t>3.8 새 교량 — 끝까지 (1~3시간)</w:t>
       </w:r>
     </w:p>
     <w:p>
@@ -3151,7 +3770,7 @@
           <w:color w:val="1F3A5F"/>
           <w:sz w:val="26"/>
         </w:rPr>
-        <w:t>3.8 결과 보기</w:t>
+        <w:t>3.9 결과 보기</w:t>
       </w:r>
     </w:p>
     <w:tbl>
@@ -3485,7 +4104,7 @@
           <w:b w:val="0"/>
           <w:sz w:val="21"/>
         </w:rPr>
-        <w:t>화면으로 보려면 대시보드: `python start.py --dashboard` (또는 `.venv\Scripts\streamlit run src\inframon\dashboard\app.py`) → 브라우저 http://localhost:8501. 왼쪽에서 교량을 고르고, 본문 ① 준비 상태 → ② 교량 선택 → ③ 📋 계획 보기 → ▶ 전체 실행 순으로 누릅니다.</w:t>
+        <w:t>화면으로 보려면 3.5 의 대시보드 — 왼쪽 포트폴리오에서 교량을 고르면 위 탭 ① InSAR · ② PINN · ③ FRAM 에 같은 결과가 나옵니다.</w:t>
       </w:r>
     </w:p>
     <w:p>
@@ -3529,7 +4148,7 @@
         <w:drawing>
           <wp:inline xmlns:a="http://schemas.openxmlformats.org/drawingml/2006/main" xmlns:pic="http://schemas.openxmlformats.org/drawingml/2006/picture">
             <wp:extent cx="5760000" cy="3581006"/>
-            <wp:docPr id="2" name="Picture 2"/>
+            <wp:docPr id="3" name="Picture 3"/>
             <wp:cNvGraphicFramePr>
               <a:graphicFrameLocks noChangeAspect="1"/>
             </wp:cNvGraphicFramePr>
@@ -3541,7 +4160,7 @@
                     <pic:cNvPicPr/>
                   </pic:nvPicPr>
                   <pic:blipFill>
-                    <a:blip r:embed="rId10"/>
+                    <a:blip r:embed="rId11"/>
                     <a:stretch>
                       <a:fillRect/>
                     </a:stretch>
@@ -3572,7 +4191,7 @@
           <w:color w:val="555F6B"/>
           <w:sz w:val="18"/>
         </w:rPr>
-        <w:t>그림 2. 정자교 — (a) PS 교축 배치 (b) 잔차고도: 교면 위 점이 지면보다 +5.2 ± 1.2 m (c) 속도 ± 95% CI (d) 시계열·추세</w:t>
+        <w:t>그림 3. 정자교 — (a) PS 교축 배치 (b) 잔차고도: 교면 위 점이 지면보다 +5.2 ± 1.2 m (c) 속도 ± 95% CI (d) 시계열·추세</w:t>
       </w:r>
     </w:p>
     <w:tbl>
@@ -4132,7 +4751,7 @@
         <w:drawing>
           <wp:inline xmlns:a="http://schemas.openxmlformats.org/drawingml/2006/main" xmlns:pic="http://schemas.openxmlformats.org/drawingml/2006/picture">
             <wp:extent cx="5760000" cy="3399405"/>
-            <wp:docPr id="3" name="Picture 3"/>
+            <wp:docPr id="4" name="Picture 4"/>
             <wp:cNvGraphicFramePr>
               <a:graphicFrameLocks noChangeAspect="1"/>
             </wp:cNvGraphicFramePr>
@@ -4144,7 +4763,7 @@
                     <pic:cNvPicPr/>
                   </pic:nvPicPr>
                   <pic:blipFill>
-                    <a:blip r:embed="rId11"/>
+                    <a:blip r:embed="rId12"/>
                     <a:stretch>
                       <a:fillRect/>
                     </a:stretch>
@@ -4175,7 +4794,7 @@
           <w:color w:val="555F6B"/>
           <w:sz w:val="18"/>
         </w:rPr>
-        <w:t>그림 3. 관측점 12개로 학습한 PINN 이 교축 200점 × 201시점의 전체 변위장을 채운다. 흰 선 = 관측점 위치. 관측점 밖은 외삽.</w:t>
+        <w:t>그림 4. 관측점 12개로 학습한 PINN 이 교축 200점 × 201시점의 전체 변위장을 채운다. 흰 선 = 관측점 위치. 관측점 밖은 외삽.</w:t>
       </w:r>
     </w:p>
     <w:p>
@@ -4662,7 +5281,7 @@
           <w:b w:val="0"/>
           <w:sz w:val="21"/>
         </w:rPr>
-        <w:t xml:space="preserve"> → 교량이 작거나 궤도 방향이 불리함. 계획(3.6)에서 장면 수·궤도를 먼저 볼 것.</w:t>
+        <w:t xml:space="preserve"> → 교량이 작거나 궤도 방향이 불리함. 계획(3.7)에서 장면 수·궤도를 먼저 볼 것.</w:t>
       </w:r>
     </w:p>
     <w:p>

</xml_diff>